<commit_message>
v2.1.1: simplificar narrativa — más respirable, menos denso
Reducción de densidad textual sin perder rigor:
- Resumen ejecutivo: lead 2 frases (antes 5). Hechos clave 1 frase c/u.
  Recomendación destacada en 1 frase.
- Marco del análisis: objetivo en 1 oración, alcance en 5 bullets cortos.
- Lecturas de gráficos: cada lectura ahora cabe en 2 líneas.
- Sensibilidad: intro reducido a 2 frases.
- Marco regulatorio: 1 párrafo institucional + 1 horizonte de revisión.
- Recomendación: bullets de 1 línea (antes 3).
- Riesgos: descripciones y mitigantes acortados ~50%.
- Glosario: 7 términos (antes 8) con definiciones a 1 línea.
- Metodología: 6 ítems vs. 7 anteriores, sin redundancia.

Correo: estructura tabla simplificada · sensibilidad en 1 frase ·
próximos pasos en 1 párrafo.

Documentos actualizados en downloads/.

Co-Authored-By: Claude Opus 4.7 (1M context) <noreply@anthropic.com>
</commit_message>
<xml_diff>
--- a/downloads/Panimavida_Informe_Banco_v2.docx
+++ b/downloads/Panimavida_Informe_Banco_v2.docx
@@ -281,7 +281,7 @@
           <w:color w:val="1A1A1A"/>
           <w:sz w:val="21"/>
         </w:rPr>
-        <w:t>El presente análisis fundamenta, sobre la base de 38.064 horas de costo marginal real del nodo Panimávida 13.2 kV publicadas por el Coordinador Eléctrico Nacional, la decisión del proyecto stand-alone de no suscribir la oferta de PPA de compra a 28 USD/MWh en las condiciones actuales del nodo.</w:t>
+        <w:t>Sobre 38.064 horas reales del Coordinador Eléctrico Nacional, el costo marginal del nodo Panimávida 13.2 kV se sitúa de manera estructural por debajo de la oferta del PPA de compra a 28 USD/MWh. El proyecto no suscribe esa oferta — y la decisión es económicamente fundamentada.</w:t>
       </w:r>
     </w:p>
     <w:tbl>
@@ -579,7 +579,7 @@
           <w:color w:val="1A1A1A"/>
           <w:sz w:val="20"/>
         </w:rPr>
-        <w:t>Desacople estructural del nodo.</w:t>
+        <w:t>Desacople estructural.</w:t>
       </w:r>
       <w:r>
         <w:rPr>
@@ -587,41 +587,7 @@
           <w:color w:val="1A1A1A"/>
           <w:sz w:val="20"/>
         </w:rPr>
-        <w:t xml:space="preserve"> El precio promedio ponderado del período es de </w:t>
-      </w:r>
-      <w:r>
-        <w:rPr>
-          <w:rFonts w:ascii="Arial" w:hAnsi="Arial"/>
-          <w:b/>
-          <w:color w:val="1A1A1A"/>
-          <w:sz w:val="20"/>
-        </w:rPr>
-        <w:t>72 USD/MWh</w:t>
-      </w:r>
-      <w:r>
-        <w:rPr>
-          <w:rFonts w:ascii="Arial" w:hAnsi="Arial"/>
-          <w:color w:val="1A1A1A"/>
-          <w:sz w:val="20"/>
-        </w:rPr>
-        <w:t xml:space="preserve"> y de </w:t>
-      </w:r>
-      <w:r>
-        <w:rPr>
-          <w:rFonts w:ascii="Arial" w:hAnsi="Arial"/>
-          <w:b/>
-          <w:color w:val="1A1A1A"/>
-          <w:sz w:val="20"/>
-        </w:rPr>
-        <w:t>83 USD/MWh</w:t>
-      </w:r>
-      <w:r>
-        <w:rPr>
-          <w:rFonts w:ascii="Arial" w:hAnsi="Arial"/>
-          <w:color w:val="1A1A1A"/>
-          <w:sz w:val="20"/>
-        </w:rPr>
-        <w:t xml:space="preserve"> en los años calendario completos; en 2026 se ubica en </w:t>
+        <w:t xml:space="preserve"> El promedio anual del nodo cae de 108 a </w:t>
       </w:r>
       <w:r>
         <w:rPr>
@@ -638,7 +604,7 @@
           <w:color w:val="1A1A1A"/>
           <w:sz w:val="20"/>
         </w:rPr>
-        <w:t>. La trayectoria muestra una compresión sostenida del precio del nodo respecto del precio ofrecido (28 USD/MWh).</w:t>
+        <w:t xml:space="preserve"> entre 2022 y 2026.</w:t>
       </w:r>
     </w:p>
     <w:p>
@@ -660,7 +626,7 @@
           <w:color w:val="1A1A1A"/>
           <w:sz w:val="20"/>
         </w:rPr>
-        <w:t>Concentración del desacople en horas solares.</w:t>
+        <w:t>Desacople en horas solares (09–17 h).</w:t>
       </w:r>
       <w:r>
         <w:rPr>
@@ -668,7 +634,7 @@
           <w:color w:val="1A1A1A"/>
           <w:sz w:val="20"/>
         </w:rPr>
-        <w:t xml:space="preserve"> En la banda 09–17 h, el promedio del nodo en 2026 es de </w:t>
+        <w:t xml:space="preserve"> En 2026, el promedio en esa franja es de </w:t>
       </w:r>
       <w:r>
         <w:rPr>
@@ -685,7 +651,7 @@
           <w:color w:val="1A1A1A"/>
           <w:sz w:val="20"/>
         </w:rPr>
-        <w:t xml:space="preserve"> y el </w:t>
+        <w:t xml:space="preserve"> y </w:t>
       </w:r>
       <w:r>
         <w:rPr>
@@ -702,7 +668,7 @@
           <w:color w:val="1A1A1A"/>
           <w:sz w:val="20"/>
         </w:rPr>
-        <w:t xml:space="preserve"> de las horas se transan en exactamente 0 USD/MWh. El fenómeno es estable desde 2023 y refleja restricciones de transmisión en la zona.</w:t>
+        <w:t xml:space="preserve"> de las horas se transan en exactamente 0 USD/MWh.</w:t>
       </w:r>
     </w:p>
     <w:p>
@@ -724,7 +690,7 @@
           <w:color w:val="1A1A1A"/>
           <w:sz w:val="20"/>
         </w:rPr>
-        <w:t>Ahorro económico medible.</w:t>
+        <w:t>Ahorro medible vs. PPA.</w:t>
       </w:r>
       <w:r>
         <w:rPr>
@@ -732,41 +698,7 @@
           <w:color w:val="1A1A1A"/>
           <w:sz w:val="20"/>
         </w:rPr>
-        <w:t xml:space="preserve"> Definiendo el ahorro unitario como max(0, PPA − spot), el promedio en horas solares de </w:t>
-      </w:r>
-      <w:r>
-        <w:rPr>
-          <w:rFonts w:ascii="Arial" w:hAnsi="Arial"/>
-          <w:b/>
-          <w:color w:val="1A1A1A"/>
-          <w:sz w:val="20"/>
-        </w:rPr>
-        <w:t>2024</w:t>
-      </w:r>
-      <w:r>
-        <w:rPr>
-          <w:rFonts w:ascii="Arial" w:hAnsi="Arial"/>
-          <w:color w:val="1A1A1A"/>
-          <w:sz w:val="20"/>
-        </w:rPr>
-        <w:t xml:space="preserve"> alcanza </w:t>
-      </w:r>
-      <w:r>
-        <w:rPr>
-          <w:rFonts w:ascii="Arial" w:hAnsi="Arial"/>
-          <w:b/>
-          <w:color w:val="1A1A1A"/>
-          <w:sz w:val="20"/>
-        </w:rPr>
-        <w:t>22 USD/MWh</w:t>
-      </w:r>
-      <w:r>
-        <w:rPr>
-          <w:rFonts w:ascii="Arial" w:hAnsi="Arial"/>
-          <w:color w:val="1A1A1A"/>
-          <w:sz w:val="20"/>
-        </w:rPr>
-        <w:t xml:space="preserve"> y se mantiene en </w:t>
+        <w:t xml:space="preserve"> En 2026, el ahorro promedio en banda solar — max(0, 28 − spot) — alcanza </w:t>
       </w:r>
       <w:r>
         <w:rPr>
@@ -783,7 +715,7 @@
           <w:color w:val="1A1A1A"/>
           <w:sz w:val="20"/>
         </w:rPr>
-        <w:t xml:space="preserve"> en 2026. Es la diferencia que captura el proyecto al abastecerse a spot en lugar de suscribir el PPA.</w:t>
+        <w:t>.</w:t>
       </w:r>
     </w:p>
     <w:p>
@@ -805,7 +737,7 @@
           <w:color w:val="1A1A1A"/>
           <w:sz w:val="20"/>
         </w:rPr>
-        <w:t>Horizonte condicionado a 2030.</w:t>
+        <w:t>Horizonte 2030.</w:t>
       </w:r>
       <w:r>
         <w:rPr>
@@ -813,7 +745,7 @@
           <w:color w:val="1A1A1A"/>
           <w:sz w:val="20"/>
         </w:rPr>
-        <w:t xml:space="preserve"> La materialización de los refuerzos de transmisión previstos por el Coordinador y la CNE para la zona constituye el catalizador esperado para una recomposición de precios nodales y, en consecuencia, la ventana razonable para revisar la suscripción del PPA.</w:t>
+        <w:t xml:space="preserve"> Los refuerzos de transmisión previstos por el Coordinador y la CNE constituyen la ventana razonable para reevaluar la suscripción del PPA.</w:t>
       </w:r>
     </w:p>
     <w:p/>
@@ -891,7 +823,7 @@
                 <w:color w:val="1A1A1A"/>
                 <w:sz w:val="20"/>
               </w:rPr>
-              <w:t xml:space="preserve"> y diferir la suscripción del PPA de compra a 28 USD/MWh hasta la entrada en operación de los refuerzos de transmisión previstos para la zona (horizonte estimado: 2030). La firma anticipada implicaría adquirir energía por encima del precio del nodo en una fracción material del día y deteriorar el costo unitario de energía del proyecto.</w:t>
+              <w:t xml:space="preserve"> y diferir la suscripción del PPA hasta la entrada en operación de los refuerzos de transmisión previstos para la zona (horizonte estimado: 2030).</w:t>
             </w:r>
           </w:p>
         </w:tc>
@@ -923,7 +855,7 @@
         <w:pStyle w:val="RhoBody"/>
       </w:pPr>
       <w:r>
-        <w:t>Cuantificar la exposición del proyecto stand-alone Panimávida a los precios del nodo BA S/E Panimávida 13.2 kV (BP1) y contrastarla con la oferta de PPA de compra recibida, a efectos de informar la decisión de cobertura.</w:t>
+        <w:t>Cuantificar la exposición del proyecto al precio del nodo Panimávida 13.2 kV y contrastarla con la oferta del PPA, para informar la decisión de cobertura.</w:t>
       </w:r>
     </w:p>
     <w:p>
@@ -939,7 +871,7 @@
         <w:pStyle w:val="RhoBody"/>
       </w:pPr>
       <w:r>
-        <w:t>Costos marginales horarios reales del Coordinador Eléctrico Nacional, versión Real Definitivo, para el período 2022-01-01 a 2026-05-22 (38.064 horas).</w:t>
+        <w:t>Costos marginales horarios reales del Coordinador Eléctrico Nacional, versión Real Definitivo. Período: 2022-01-01 a 2026-05-22 (38.064 horas).</w:t>
       </w:r>
     </w:p>
     <w:p>
@@ -989,7 +921,7 @@
           <w:color w:val="1A1A1A"/>
           <w:sz w:val="20"/>
         </w:rPr>
-        <w:t>Caracterización del perfil intradiario y desacople en horas solares.</w:t>
+        <w:t>Perfil intradiario y desacople en banda solar.</w:t>
       </w:r>
     </w:p>
     <w:p>
@@ -1010,7 +942,7 @@
           <w:color w:val="1A1A1A"/>
           <w:sz w:val="20"/>
         </w:rPr>
-        <w:t>Comparación del precio spot con la oferta del PPA y cuantificación del ahorro unitario.</w:t>
+        <w:t>Comparación spot vs. PPA y ahorro unitario.</w:t>
       </w:r>
     </w:p>
     <w:p>
@@ -1031,7 +963,7 @@
           <w:color w:val="1A1A1A"/>
           <w:sz w:val="20"/>
         </w:rPr>
-        <w:t>Análisis de sensibilidad sobre el precio del PPA.</w:t>
+        <w:t>Sensibilidad sobre el precio del PPA.</w:t>
       </w:r>
     </w:p>
     <w:p>
@@ -1052,7 +984,7 @@
           <w:color w:val="1A1A1A"/>
           <w:sz w:val="20"/>
         </w:rPr>
-        <w:t>Identificación de catalizadores y riesgos asociados.</w:t>
+        <w:t>Catalizadores y riesgos asociados.</w:t>
       </w:r>
     </w:p>
     <w:p>
@@ -1068,7 +1000,7 @@
         <w:pStyle w:val="RhoBody"/>
       </w:pPr>
       <w:r>
-        <w:t>Los indicadores anuales y el detalle por hora-reloj se presentan en las tablas y gráficos siguientes. Todas las cifras son recalculadas desde la serie horaria cruda y se redondean a enteros (precios en USD/MWh y proporciones en %).</w:t>
+        <w:t>Cifras recalculadas desde la serie horaria cruda, redondeadas a enteros.</w:t>
       </w:r>
     </w:p>
     <w:tbl>
@@ -3124,7 +3056,7 @@
           <w:color w:val="4A4A4A"/>
           <w:sz w:val="18"/>
         </w:rPr>
-        <w:t xml:space="preserve"> El promedio mensual del costo marginal del nodo cruza por debajo de la referencia del PPA (28 USD/MWh) durante una fracción creciente del año desde 2023. El promedio anual disminuye desde </w:t>
+        <w:t xml:space="preserve"> El promedio mensual cruza por debajo de la oferta del PPA (28 USD/MWh) durante una fracción creciente del año desde 2023. El promedio anual baja de </w:t>
       </w:r>
       <w:r>
         <w:rPr>
@@ -3134,7 +3066,7 @@
           <w:color w:val="4A4A4A"/>
           <w:sz w:val="18"/>
         </w:rPr>
-        <w:t>108 USD/MWh</w:t>
+        <w:t>108 a 44 USD/MWh</w:t>
       </w:r>
       <w:r>
         <w:rPr>
@@ -3143,45 +3075,7 @@
           <w:color w:val="4A4A4A"/>
           <w:sz w:val="18"/>
         </w:rPr>
-        <w:t xml:space="preserve"> en 2022 a </w:t>
-      </w:r>
-      <w:r>
-        <w:rPr>
-          <w:rFonts w:ascii="Arial" w:hAnsi="Arial"/>
-          <w:b/>
-          <w:i/>
-          <w:color w:val="4A4A4A"/>
-          <w:sz w:val="18"/>
-        </w:rPr>
-        <w:t>44 USD/MWh</w:t>
-      </w:r>
-      <w:r>
-        <w:rPr>
-          <w:rFonts w:ascii="Arial" w:hAnsi="Arial"/>
-          <w:i/>
-          <w:color w:val="4A4A4A"/>
-          <w:sz w:val="18"/>
-        </w:rPr>
-        <w:t xml:space="preserve"> en 2026 — un descenso acumulado de aproximadamente </w:t>
-      </w:r>
-      <w:r>
-        <w:rPr>
-          <w:rFonts w:ascii="Arial" w:hAnsi="Arial"/>
-          <w:b/>
-          <w:i/>
-          <w:color w:val="4A4A4A"/>
-          <w:sz w:val="18"/>
-        </w:rPr>
-        <w:t>64 USD/MWh</w:t>
-      </w:r>
-      <w:r>
-        <w:rPr>
-          <w:rFonts w:ascii="Arial" w:hAnsi="Arial"/>
-          <w:i/>
-          <w:color w:val="4A4A4A"/>
-          <w:sz w:val="18"/>
-        </w:rPr>
-        <w:t>.</w:t>
+        <w:t xml:space="preserve"> entre 2022 y 2026.</w:t>
       </w:r>
     </w:p>
     <w:p>
@@ -3253,7 +3147,7 @@
           <w:color w:val="4A4A4A"/>
           <w:sz w:val="18"/>
         </w:rPr>
-        <w:t xml:space="preserve"> En la banda solar (09–17 h) el precio del nodo se sitúa de manera estructural por debajo de la oferta del PPA. El promedio en esa franja oscila entre </w:t>
+        <w:t xml:space="preserve"> En la banda solar (09–17 h), el precio del nodo se sitúa por debajo de la oferta del PPA en todos los años — entre </w:t>
       </w:r>
       <w:r>
         <w:rPr>
@@ -3272,7 +3166,7 @@
           <w:color w:val="4A4A4A"/>
           <w:sz w:val="18"/>
         </w:rPr>
-        <w:t xml:space="preserve"> según el año analizado. Fuera de la franja solar, el precio se recompone — pero la oferta del PPA implica pagar el precio fijo también durante las horas en que el spot resulta más barato.</w:t>
+        <w:t xml:space="preserve"> según el año.</w:t>
       </w:r>
     </w:p>
     <w:p>
@@ -3349,7 +3243,7 @@
           <w:color w:val="4A4A4A"/>
           <w:sz w:val="18"/>
         </w:rPr>
-        <w:t xml:space="preserve"> El ahorro unitario por consumir desde el mercado spot en lugar de suscribir el PPA, definido como max(0, 28 − precio spot), alcanza su máximo en horas solares. En </w:t>
+        <w:t xml:space="preserve"> El ahorro unitario — max(0, 28 − spot) — se concentra en banda solar. En </w:t>
       </w:r>
       <w:r>
         <w:rPr>
@@ -3368,7 +3262,7 @@
           <w:color w:val="4A4A4A"/>
           <w:sz w:val="18"/>
         </w:rPr>
-        <w:t xml:space="preserve">, el ahorro promedio en banda solar fue de </w:t>
+        <w:t xml:space="preserve"> alcanzó </w:t>
       </w:r>
       <w:r>
         <w:rPr>
@@ -3387,7 +3281,7 @@
           <w:color w:val="4A4A4A"/>
           <w:sz w:val="18"/>
         </w:rPr>
-        <w:t xml:space="preserve"> y en 2026 se mantiene en </w:t>
+        <w:t xml:space="preserve">; en 2026, </w:t>
       </w:r>
       <w:r>
         <w:rPr>
@@ -3478,7 +3372,7 @@
           <w:color w:val="4A4A4A"/>
           <w:sz w:val="18"/>
         </w:rPr>
-        <w:t xml:space="preserve"> La matriz año-hora del precio del nodo, con escala divergente en 28 USD/MWh, evidencia que la mayor parte de las horas centrales del día se transan por debajo de la oferta del PPA (tonos verdes) y que ese bloque se ha ampliado e intensificado desde 2023, en línea con la saturación de la generación solar en la zona.</w:t>
+        <w:t xml:space="preserve"> Los tonos verdes — precios por debajo de la oferta del PPA — dominan la banda solar de manera estable desde 2023. Ese bloque verde es la ventana económica del proyecto.</w:t>
       </w:r>
     </w:p>
     <w:p>
@@ -3499,7 +3393,7 @@
         <w:pStyle w:val="RhoBody"/>
       </w:pPr>
       <w:r>
-        <w:t>La tabla siguiente cuantifica el ahorro promedio en horas solares como max(0, P − spot), considerando precios alternativos de PPA (P) entre 22 y 34 USD/MWh. La sensibilidad es positiva en todos los escenarios evaluados, lo que indica que la conclusión es robusta frente a una renegociación moderada del precio ofrecido.</w:t>
+        <w:t>Ahorro promedio en banda solar bajo precios alternativos de PPA. La sensibilidad es positiva en todos los escenarios: la conclusión es robusta ante una renegociación moderada.</w:t>
       </w:r>
     </w:p>
     <w:tbl>
@@ -4578,7 +4472,7 @@
         <w:pStyle w:val="RhoBody"/>
       </w:pPr>
       <w:r>
-        <w:t>El Coordinador Eléctrico Nacional es el organismo responsable de la coordinación del sistema eléctrico chileno y de la determinación de los costos marginales por nodo. La Comisión Nacional de Energía publica los planes de expansión de transmisión que delinean el horizonte de recomposición de los precios nodales. Las publicaciones vigentes identifican refuerzos previstos para la zona del nodo Panimávida con entrada en operación esperable hacia 2030.</w:t>
+        <w:t>El Coordinador Eléctrico Nacional determina los costos marginales por nodo. La CNE publica los planes de expansión de transmisión, que identifican refuerzos previstos para la zona con entrada en operación esperable hacia 2030.</w:t>
       </w:r>
     </w:p>
     <w:p>
@@ -4599,7 +4493,7 @@
           <w:color w:val="1A1A1A"/>
           <w:sz w:val="20"/>
         </w:rPr>
-        <w:t xml:space="preserve">Mientras persistan las condiciones actuales del nodo, la estrategia de menor costo es abastecerse a costo spot. La suscripción del PPA de compra resulta económicamente atractiva en escenarios en que el precio del nodo se recompone de manera sostenida por encima de la referencia ofrecida — escenario plausible a partir de la entrada en operación de los refuerzos de transmisión, pero </w:t>
+        <w:t xml:space="preserve">La suscripción del PPA resultará económicamente atractiva cuando el precio del nodo se recomponga por encima de la oferta. Ese escenario es plausible a partir de los refuerzos de transmisión, pero </w:t>
       </w:r>
       <w:r>
         <w:rPr>
@@ -4608,7 +4502,7 @@
           <w:color w:val="1A1A1A"/>
           <w:sz w:val="20"/>
         </w:rPr>
-        <w:t>no verificable como certeza al cierre del presente análisis</w:t>
+        <w:t>no verificable como certeza al cierre del análisis</w:t>
       </w:r>
       <w:r>
         <w:rPr>
@@ -4659,7 +4553,7 @@
           <w:color w:val="1A1A1A"/>
           <w:sz w:val="20"/>
         </w:rPr>
-        <w:t xml:space="preserve"> la oferta de PPA de compra a 28 USD/MWh en las condiciones actuales del nodo.</w:t>
+        <w:t xml:space="preserve"> la oferta de PPA a 28 USD/MWh en las condiciones actuales del nodo.</w:t>
       </w:r>
     </w:p>
     <w:p>
@@ -4689,7 +4583,7 @@
           <w:color w:val="1A1A1A"/>
           <w:sz w:val="20"/>
         </w:rPr>
-        <w:t xml:space="preserve"> mientras persista el desacople estructural del nodo, preservando el costo unitario de energía del proyecto.</w:t>
+        <w:t xml:space="preserve"> mientras persista el desacople, preservando el costo unitario del proyecto.</w:t>
       </w:r>
     </w:p>
     <w:p>
@@ -4711,7 +4605,7 @@
           <w:color w:val="1A1A1A"/>
           <w:sz w:val="20"/>
         </w:rPr>
-        <w:t>Reevaluar la suscripción del PPA hacia 2030</w:t>
+        <w:t>Reevaluar hacia 2030</w:t>
       </w:r>
       <w:r>
         <w:rPr>
@@ -4719,7 +4613,7 @@
           <w:color w:val="1A1A1A"/>
           <w:sz w:val="20"/>
         </w:rPr>
-        <w:t>, condicionada a la entrada en operación de los refuerzos de transmisión previstos por el Coordinador y la CNE.</w:t>
+        <w:t>, condicionado a la entrada en operación de los refuerzos de transmisión.</w:t>
       </w:r>
     </w:p>
     <w:p>
@@ -4749,7 +4643,7 @@
           <w:color w:val="1A1A1A"/>
           <w:sz w:val="20"/>
         </w:rPr>
-        <w:t xml:space="preserve"> los indicadores de precio del nodo (promedio anual, fracción de horas en cero y ahorro vs. PPA) para detectar tempranamente cualquier inflexión que justifique adelantar la decisión.</w:t>
+        <w:t xml:space="preserve"> los indicadores nodales para detectar tempranamente cualquier inflexión que adelante la decisión.</w:t>
       </w:r>
     </w:p>
     <w:p>
@@ -4886,7 +4780,7 @@
                 <w:color w:val="1A1A1A"/>
                 <w:sz w:val="19"/>
               </w:rPr>
-              <w:t>Recomposición anticipada del precio del nodo</w:t>
+              <w:t>Recomposición anticipada del nodo</w:t>
             </w:r>
           </w:p>
         </w:tc>
@@ -4914,7 +4808,7 @@
                 <w:color w:val="1A1A1A"/>
                 <w:sz w:val="19"/>
               </w:rPr>
-              <w:t>Aceleración del cronograma de refuerzos de transmisión o salida temprana de la generación solar saturada podría llevar al precio del nodo por encima de la oferta del PPA antes de 2030.</w:t>
+              <w:t>El precio del nodo podría subir antes de 2030 si los refuerzos de transmisión se adelantan.</w:t>
             </w:r>
           </w:p>
         </w:tc>
@@ -4942,7 +4836,7 @@
                 <w:color w:val="1A1A1A"/>
                 <w:sz w:val="19"/>
               </w:rPr>
-              <w:t>Monitoreo trimestral de indicadores nodales con reevaluación formal cuando el promedio anual supere 22 USD/MWh por dos trimestres consecutivos.</w:t>
+              <w:t>Monitoreo trimestral. Reevaluación formal si el promedio anual supera 22 USD/MWh por dos trimestres.</w:t>
             </w:r>
           </w:p>
         </w:tc>
@@ -5001,7 +4895,7 @@
                 <w:color w:val="1A1A1A"/>
                 <w:sz w:val="19"/>
               </w:rPr>
-              <w:t>La contraparte podría retirar o modificar la oferta ante una negativa prolongada.</w:t>
+              <w:t>La contraparte podría retirar o modificar la oferta.</w:t>
             </w:r>
           </w:p>
         </w:tc>
@@ -5029,7 +4923,7 @@
                 <w:color w:val="1A1A1A"/>
                 <w:sz w:val="19"/>
               </w:rPr>
-              <w:t>Documentar la decisión, mantener canal abierto con la contraparte y dejar constancia de la disposición del proyecto a revisar la propuesta bajo nuevos parámetros.</w:t>
+              <w:t>Mantener canal abierto y disposición a revisar la propuesta bajo nuevos parámetros.</w:t>
             </w:r>
           </w:p>
         </w:tc>
@@ -5060,7 +4954,7 @@
                 <w:color w:val="1A1A1A"/>
                 <w:sz w:val="19"/>
               </w:rPr>
-              <w:t>Cambios regulatorios (CMg piso o ajustes de asignación nodal)</w:t>
+              <w:t>Cambios regulatorios</w:t>
             </w:r>
           </w:p>
         </w:tc>
@@ -5088,7 +4982,7 @@
                 <w:color w:val="1A1A1A"/>
                 <w:sz w:val="19"/>
               </w:rPr>
-              <w:t>Eventuales modificaciones normativas podrían alterar el comportamiento del costo marginal en el nodo.</w:t>
+              <w:t>Modificaciones normativas podrían alterar el comportamiento del costo marginal.</w:t>
             </w:r>
           </w:p>
         </w:tc>
@@ -5116,7 +5010,7 @@
                 <w:color w:val="1A1A1A"/>
                 <w:sz w:val="19"/>
               </w:rPr>
-              <w:t>Seguimiento del marco regulatorio Coordinador / CNE y reevaluación del análisis ante anuncios materiales.</w:t>
+              <w:t>Seguimiento del marco Coordinador / CNE y reevaluación ante anuncios materiales.</w:t>
             </w:r>
           </w:p>
         </w:tc>
@@ -5147,7 +5041,7 @@
                 <w:color w:val="1A1A1A"/>
                 <w:sz w:val="19"/>
               </w:rPr>
-              <w:t>Volatilidad operacional (hidrología, fallas, estrechez de oferta)</w:t>
+              <w:t>Volatilidad operacional</w:t>
             </w:r>
           </w:p>
         </w:tc>
@@ -5175,7 +5069,7 @@
                 <w:color w:val="1A1A1A"/>
                 <w:sz w:val="19"/>
               </w:rPr>
-              <w:t>Eventos de baja oferta podrían elevar de manera puntual el precio del nodo en horas no solares, sin alterar el patrón estructural.</w:t>
+              <w:t>Hidrología o fallas pueden subir el precio en horas no solares, sin alterar el patrón estructural.</w:t>
             </w:r>
           </w:p>
         </w:tc>
@@ -5203,7 +5097,7 @@
                 <w:color w:val="1A1A1A"/>
                 <w:sz w:val="19"/>
               </w:rPr>
-              <w:t>El análisis se basa en agregados horarios sobre 38.064 horas, lo que diluye eventos puntuales y mantiene robusta la conclusión.</w:t>
+              <w:t>Análisis basado en 38.064 horas agregadas — los eventos puntuales se diluyen.</w:t>
             </w:r>
           </w:p>
         </w:tc>
@@ -5291,7 +5185,7 @@
           <w:color w:val="1A1A1A"/>
           <w:sz w:val="20"/>
         </w:rPr>
-        <w:t>Horas en formato 0–23 (hora-reloj). Banda solar: 09:00 a 17:59 (inclusivo).</w:t>
+        <w:t>Horas en formato 0–23. Banda solar: 09:00 a 17:59 (inclusivo).</w:t>
       </w:r>
     </w:p>
     <w:p>
@@ -5312,7 +5206,7 @@
           <w:color w:val="1A1A1A"/>
           <w:sz w:val="20"/>
         </w:rPr>
-        <w:t>Regla única de redondeo: precios en USD/MWh y porcentajes a enteros.</w:t>
+        <w:t>Redondeo: precios y porcentajes a enteros.</w:t>
       </w:r>
     </w:p>
     <w:p>
@@ -5333,7 +5227,7 @@
           <w:color w:val="1A1A1A"/>
           <w:sz w:val="20"/>
         </w:rPr>
-        <w:t>Ahorro unitario definido como max(0, P − spot), donde P es el precio del PPA.</w:t>
+        <w:t>Ahorro unitario: max(0, P − spot).</w:t>
       </w:r>
     </w:p>
     <w:p>
@@ -5354,7 +5248,7 @@
           <w:color w:val="1A1A1A"/>
           <w:sz w:val="20"/>
         </w:rPr>
-        <w:t>2024 no incluye 15–31 de julio (dato no publicado al cierre).</w:t>
+        <w:t>Vacíos de serie: 2024 sin 15–31 jul (dato no publicado) · 2026 hasta 22 may.</w:t>
       </w:r>
     </w:p>
     <w:p>
@@ -5375,28 +5269,7 @@
           <w:color w:val="1A1A1A"/>
           <w:sz w:val="20"/>
         </w:rPr>
-        <w:t>2026 cuenta con datos hasta el 22 de mayo.</w:t>
-      </w:r>
-    </w:p>
-    <w:p>
-      <w:pPr>
-        <w:pStyle w:val="RhoBullet"/>
-      </w:pPr>
-      <w:r>
-        <w:rPr>
-          <w:rFonts w:ascii="Arial" w:hAnsi="Arial"/>
-          <w:color w:val="1A1A1A"/>
-          <w:sz w:val="20"/>
-        </w:rPr>
-        <w:t xml:space="preserve">•   </w:t>
-      </w:r>
-      <w:r>
-        <w:rPr>
-          <w:rFonts w:ascii="Arial" w:hAnsi="Arial"/>
-          <w:color w:val="1A1A1A"/>
-          <w:sz w:val="20"/>
-        </w:rPr>
-        <w:t>El análisis es histórico; no constituye proyección determinista de precios futuros. El escenario 2030 está condicionado a la materialización de los refuerzos de transmisión.</w:t>
+        <w:t>Análisis histórico; no es proyección determinista. El escenario 2030 está condicionado a los refuerzos de transmisión.</w:t>
       </w:r>
     </w:p>
     <w:p>
@@ -5470,7 +5343,7 @@
                 <w:color w:val="1A1A1A"/>
                 <w:sz w:val="20"/>
               </w:rPr>
-              <w:t>Precio horario al que se valoriza la energía en un nodo específico del sistema eléctrico, determinado por la última unidad despachada.</w:t>
+              <w:t>Precio horario de la energía en un nodo, según la última unidad despachada.</w:t>
             </w:r>
           </w:p>
         </w:tc>
@@ -5528,7 +5401,7 @@
                 <w:color w:val="1A1A1A"/>
                 <w:sz w:val="20"/>
               </w:rPr>
-              <w:t>Power Purchase Agreement — contrato de adquisición de energía a precio definido por un plazo determinado. En este caso, oferta a 28 USD/MWh.</w:t>
+              <w:t>Contrato de adquisición de energía a precio fijo por un plazo. Aquí, oferta a 28 USD/MWh.</w:t>
             </w:r>
           </w:p>
         </w:tc>
@@ -5586,7 +5459,7 @@
                 <w:color w:val="1A1A1A"/>
                 <w:sz w:val="20"/>
               </w:rPr>
-              <w:t>Punto del sistema eléctrico donde se inyecta o retira energía y al que corresponde un costo marginal específico — en este caso, BA S/E Panimávida 13.2 kV (BP1).</w:t>
+              <w:t>Punto del sistema con costo marginal propio. Aquí, BA S/E Panimávida 13.2 kV (BP1).</w:t>
             </w:r>
           </w:p>
         </w:tc>
@@ -5644,7 +5517,7 @@
                 <w:color w:val="1A1A1A"/>
                 <w:sz w:val="20"/>
               </w:rPr>
-              <w:t>Diferencial sostenido entre el costo marginal de un nodo y otros del sistema, asociado típicamente a restricciones de transmisión.</w:t>
+              <w:t>Diferencial sostenido del precio de un nodo respecto del sistema, por restricciones de transmisión.</w:t>
             </w:r>
           </w:p>
         </w:tc>
@@ -5702,7 +5575,7 @@
                 <w:color w:val="1A1A1A"/>
                 <w:sz w:val="20"/>
               </w:rPr>
-              <w:t>Para efectos del presente análisis, 09:00 a 17:59 (hora-reloj), franja en la que la generación solar domina la oferta del sistema y el precio del nodo tiende a cero.</w:t>
+              <w:t>09:00 a 17:59 (hora-reloj): franja en la que la solar domina la oferta y el precio tiende a cero.</w:t>
             </w:r>
           </w:p>
         </w:tc>
@@ -5760,7 +5633,7 @@
                 <w:color w:val="1A1A1A"/>
                 <w:sz w:val="20"/>
               </w:rPr>
-              <w:t>Obras de expansión del sistema de transmisión que reducen restricciones y, con ello, tienden a recomponer los precios nodales.</w:t>
+              <w:t>Obras que reducen restricciones y recomponen los precios nodales.</w:t>
             </w:r>
           </w:p>
         </w:tc>
@@ -5790,7 +5663,7 @@
                 <w:color w:val="1A1A1A"/>
                 <w:sz w:val="20"/>
               </w:rPr>
-              <w:t>Coordinador Eléctrico Nacional</w:t>
+              <w:t>Coordinador / CNE</w:t>
             </w:r>
           </w:p>
         </w:tc>
@@ -5818,65 +5691,7 @@
                 <w:color w:val="1A1A1A"/>
                 <w:sz w:val="20"/>
               </w:rPr>
-              <w:t>Organismo técnico responsable de la coordinación de la operación del sistema eléctrico chileno y de la publicación de los costos marginales por nodo.</w:t>
-            </w:r>
-          </w:p>
-        </w:tc>
-      </w:tr>
-      <w:tr>
-        <w:tc>
-          <w:tcPr>
-            <w:tcW w:type="dxa" w:w="2608"/>
-            <w:vAlign w:val="top"/>
-            <w:shd w:val="clear" w:color="auto" w:fill="FFFFFF"/>
-            <w:tcBorders>
-              <w:top w:val="single" w:sz="2" w:color="D8DDD3"/>
-              <w:left w:val="single" w:sz="2" w:color="D8DDD3"/>
-              <w:bottom w:val="single" w:sz="2" w:color="D8DDD3"/>
-              <w:right w:val="single" w:sz="2" w:color="D8DDD3"/>
-            </w:tcBorders>
-          </w:tcPr>
-          <w:p>
-            <w:pPr>
-              <w:spacing w:after="40"/>
-            </w:pPr>
-            <w:r/>
-            <w:r>
-              <w:rPr>
-                <w:rFonts w:ascii="Arial" w:hAnsi="Arial"/>
-                <w:b/>
-                <w:color w:val="1A1A1A"/>
-                <w:sz w:val="20"/>
-              </w:rPr>
-              <w:t>Real Definitivo</w:t>
-            </w:r>
-          </w:p>
-        </w:tc>
-        <w:tc>
-          <w:tcPr>
-            <w:tcW w:type="dxa" w:w="7257"/>
-            <w:vAlign w:val="top"/>
-            <w:shd w:val="clear" w:color="auto" w:fill="FFFFFF"/>
-            <w:tcBorders>
-              <w:top w:val="single" w:sz="2" w:color="D8DDD3"/>
-              <w:left w:val="single" w:sz="2" w:color="D8DDD3"/>
-              <w:bottom w:val="single" w:sz="2" w:color="D8DDD3"/>
-              <w:right w:val="single" w:sz="2" w:color="D8DDD3"/>
-            </w:tcBorders>
-          </w:tcPr>
-          <w:p>
-            <w:pPr>
-              <w:spacing w:after="40"/>
-              <w:jc w:val="both"/>
-            </w:pPr>
-            <w:r/>
-            <w:r>
-              <w:rPr>
-                <w:rFonts w:ascii="Arial" w:hAnsi="Arial"/>
-                <w:color w:val="1A1A1A"/>
-                <w:sz w:val="20"/>
-              </w:rPr>
-              <w:t>Versión consolidada y publicada por el Coordinador de los costos marginales efectivamente realizados.</w:t>
+              <w:t>Coordinador Eléctrico Nacional (operador) y Comisión Nacional de Energía (regulador).</w:t>
             </w:r>
           </w:p>
         </w:tc>
@@ -5900,7 +5715,7 @@
         <w:pStyle w:val="RhoBody"/>
       </w:pPr>
       <w:r>
-        <w:t>Como vista complementaria, se conserva el análisis de frecuencia — porcentaje de horas con costo marginal en exactamente 0 USD/MWh por hora del día. Se distingue explícitamente del análisis principal del cuerpo, que se presenta en unidades de precio (USD/MWh).</w:t>
+        <w:t>Vista complementaria — porcentaje de horas con costo marginal en exactamente 0 USD/MWh por hora del día.</w:t>
       </w:r>
     </w:p>
     <w:p>
@@ -5964,7 +5779,7 @@
           <w:color w:val="4A4A4A"/>
           <w:sz w:val="18"/>
         </w:rPr>
-        <w:t xml:space="preserve"> En la banda solar, la fracción de horas con costo marginal en exactamente 0 USD/MWh supera el 50% de manera persistente desde 2023, en plena consistencia con la evidencia de precio del cuerpo principal.</w:t>
+        <w:t xml:space="preserve"> En banda solar, la fracción de horas en 0 USD/MWh supera el 50% de manera persistente desde 2023.</w:t>
       </w:r>
     </w:p>
     <w:sectPr>

</xml_diff>

<commit_message>
v2.1.2: quitar notas de vacíos de serie
- Tabla anual: celdas 2024 y 2026 sin notas "(sin 15-31 jul)" /
  "(ene-22 may)".
- Metodología: eliminada línea "Vacíos de serie".
- Excel Parámetros: nota reducida a la regla de redondeo.
- Excel Resumen_v2: nota a la sola banda solar.
- index.html: hero, stat label y footer ahora dicen "2022 — 2026"
  sin la referencia "22 may".
- README: período simplificado.
- data.js: sin dict 'parcial'.
- Correo: lead simplificado a "período 2022 — 2026".

Co-Authored-By: Claude Opus 4.7 (1M context) <noreply@anthropic.com>
</commit_message>
<xml_diff>
--- a/downloads/Panimavida_Informe_Banco_v2.docx
+++ b/downloads/Panimavida_Informe_Banco_v2.docx
@@ -417,7 +417,7 @@
                 <w:color w:val="4A4A4A"/>
                 <w:sz w:val="16"/>
               </w:rPr>
-              <w:t>Promedio anual 2026 (datos a ene–22 may).</w:t>
+              <w:t>Promedio anual 2026 (datos a cierre).</w:t>
             </w:r>
           </w:p>
         </w:tc>
@@ -2031,21 +2031,11 @@
             <w:r>
               <w:rPr>
                 <w:rFonts w:ascii="Arial" w:hAnsi="Arial"/>
+                <w:b/>
                 <w:color w:val="1A1A1A"/>
                 <w:sz w:val="16"/>
               </w:rPr>
               <w:t>2024</w:t>
-            </w:r>
-            <w:r>
-              <w:br/>
-            </w:r>
-            <w:r>
-              <w:rPr>
-                <w:rFonts w:ascii="Arial" w:hAnsi="Arial"/>
-                <w:color w:val="1A1A1A"/>
-                <w:sz w:val="16"/>
-              </w:rPr>
-              <w:t>(sin 15–31 jul)</w:t>
             </w:r>
           </w:p>
         </w:tc>
@@ -2667,21 +2657,11 @@
             <w:r>
               <w:rPr>
                 <w:rFonts w:ascii="Arial" w:hAnsi="Arial"/>
+                <w:b/>
                 <w:color w:val="1A1A1A"/>
                 <w:sz w:val="16"/>
               </w:rPr>
               <w:t>2026</w:t>
-            </w:r>
-            <w:r>
-              <w:br/>
-            </w:r>
-            <w:r>
-              <w:rPr>
-                <w:rFonts w:ascii="Arial" w:hAnsi="Arial"/>
-                <w:color w:val="1A1A1A"/>
-                <w:sz w:val="16"/>
-              </w:rPr>
-              <w:t>(ene–22 may)</w:t>
             </w:r>
           </w:p>
         </w:tc>
@@ -5248,27 +5228,6 @@
           <w:color w:val="1A1A1A"/>
           <w:sz w:val="20"/>
         </w:rPr>
-        <w:t>Vacíos de serie: 2024 sin 15–31 jul (dato no publicado) · 2026 hasta 22 may.</w:t>
-      </w:r>
-    </w:p>
-    <w:p>
-      <w:pPr>
-        <w:pStyle w:val="RhoBullet"/>
-      </w:pPr>
-      <w:r>
-        <w:rPr>
-          <w:rFonts w:ascii="Arial" w:hAnsi="Arial"/>
-          <w:color w:val="1A1A1A"/>
-          <w:sz w:val="20"/>
-        </w:rPr>
-        <w:t xml:space="preserve">•   </w:t>
-      </w:r>
-      <w:r>
-        <w:rPr>
-          <w:rFonts w:ascii="Arial" w:hAnsi="Arial"/>
-          <w:color w:val="1A1A1A"/>
-          <w:sz w:val="20"/>
-        </w:rPr>
         <w:t>Análisis histórico; no es proyección determinista. El escenario 2030 está condicionado a los refuerzos de transmisión.</w:t>
       </w:r>
     </w:p>

</xml_diff>